<commit_message>
Convert top nav to left sidebar, add guide/lists pages, expand tables and content
- Replace horizontal top nav with persistent left sidebar navigation
- Add GuidePage and ListsOverviewPage with routing
- Expand tables content across Word, PowerPoint, PDF, and Canvas pages
- Update color, language, text alternatives, and seizure risk pages
- Refine workshop document and course content markdown
- Add presentation outline
- Update tests and playwright config

Made-with: Cursor
</commit_message>
<xml_diff>
--- a/Test files/tables/tables-word.docx
+++ b/Test files/tables/tables-word.docx
@@ -2924,7 +2924,36 @@
       </w:tr>
     </w:tbl>
     <w:p/>
-    <w:p/>
+    <w:p>
+      <w:pPr>
+        <w:pStyle w:val="Heading2"/>
+      </w:pPr>
+      <w:r>
+        <w:t>Table captions</w:t>
+      </w:r>
+    </w:p>
+    <w:p>
+      <w:r>
+        <w:t xml:space="preserve">Table captions are called out as accessibility errors in the Rich Content Editor in </w:t>
+      </w:r>
+      <w:proofErr w:type="gramStart"/>
+      <w:r>
+        <w:t>Canvas</w:t>
+      </w:r>
+      <w:proofErr w:type="gramEnd"/>
+      <w:r>
+        <w:t xml:space="preserve"> but they do not show up in the Accessibility Dashboard, nor do they impact the accessibility conformance of the table. T</w:t>
+      </w:r>
+      <w:r>
+        <w:t>hey are not required to meet WCAG</w:t>
+      </w:r>
+      <w:r>
+        <w:t xml:space="preserve"> but may offer value for screen reader users and can be considered a best practice</w:t>
+      </w:r>
+      <w:r>
+        <w:t>.</w:t>
+      </w:r>
+    </w:p>
     <w:sectPr>
       <w:type w:val="continuous"/>
       <w:pgSz w:w="12240" w:h="15840"/>

</xml_diff>

<commit_message>
Add Lists category, expand Tables/Color/SemanticStructure content, update tests and workshop doc
- Add Lists category: overview + Word/PowerPoint/PDF/Canvas pages, Astro routes, AppShell registration
- Expand TablesOverviewPage and TablesWordPage with additional scenarios and fixes
- Expand ColorOverviewPage with updated layout and content
- Expand SemanticStructureOverviewPage with additional sections
- Update SeizureRisk, Language, and other overview pages with content improvements
- Add new test files (Word, PDF, PPTX) and public assets (seizure dashboard screenshots)
- Update playwright config and a11y test specs
- Update workshop HTML doc (course-content-accessibility.html) with new content
- Update a11y-testing-contract.md

Co-Authored-By: Claude Sonnet 4.6 <noreply@anthropic.com>
</commit_message>
<xml_diff>
--- a/Test files/tables/tables-word.docx
+++ b/Test files/tables/tables-word.docx
@@ -606,28 +606,7 @@
                 <w:b/>
                 <w:bCs/>
               </w:rPr>
-              <w:t>9</w:t>
-            </w:r>
-            <w:r>
-              <w:rPr>
-                <w:b/>
-                <w:bCs/>
-              </w:rPr>
-              <w:t>:00 – 1</w:t>
-            </w:r>
-            <w:r>
-              <w:rPr>
-                <w:b/>
-                <w:bCs/>
-              </w:rPr>
-              <w:t>0</w:t>
-            </w:r>
-            <w:r>
-              <w:rPr>
-                <w:b/>
-                <w:bCs/>
-              </w:rPr>
-              <w:t>:00 AM</w:t>
+              <w:t>9:00 – 10:00 AM</w:t>
             </w:r>
           </w:p>
         </w:tc>
@@ -680,14 +659,7 @@
                 <w:b/>
                 <w:bCs/>
               </w:rPr>
-              <w:t>10</w:t>
-            </w:r>
-            <w:r>
-              <w:rPr>
-                <w:b/>
-                <w:bCs/>
-              </w:rPr>
-              <w:t>:00 – 11:00 AM</w:t>
+              <w:t>10:00 – 11:00 AM</w:t>
             </w:r>
           </w:p>
         </w:tc>
@@ -1087,10 +1059,7 @@
           </w:tcPr>
           <w:p>
             <w:r>
-              <w:t>3</w:t>
-            </w:r>
-            <w:r>
-              <w:t>0,000</w:t>
+              <w:t>30,000</w:t>
             </w:r>
           </w:p>
         </w:tc>
@@ -1100,10 +1069,7 @@
           </w:tcPr>
           <w:p>
             <w:r>
-              <w:t>10</w:t>
-            </w:r>
-            <w:r>
-              <w:t>0,000</w:t>
+              <w:t>100,000</w:t>
             </w:r>
           </w:p>
         </w:tc>
@@ -1113,10 +1079,7 @@
           </w:tcPr>
           <w:p>
             <w:r>
-              <w:t>8</w:t>
-            </w:r>
-            <w:r>
-              <w:t>0,000</w:t>
+              <w:t>80,000</w:t>
             </w:r>
           </w:p>
         </w:tc>
@@ -1149,10 +1112,7 @@
           </w:tcPr>
           <w:p>
             <w:r>
-              <w:t>1</w:t>
-            </w:r>
-            <w:r>
-              <w:t>0,000</w:t>
+              <w:t>10,000</w:t>
             </w:r>
           </w:p>
         </w:tc>
@@ -1172,10 +1132,7 @@
           </w:tcPr>
           <w:p>
             <w:r>
-              <w:t>12</w:t>
-            </w:r>
-            <w:r>
-              <w:t>,000</w:t>
+              <w:t>12,000</w:t>
             </w:r>
           </w:p>
         </w:tc>
@@ -1185,10 +1142,7 @@
           </w:tcPr>
           <w:p>
             <w:r>
-              <w:t>9</w:t>
-            </w:r>
-            <w:r>
-              <w:t>,000</w:t>
+              <w:t>9,000</w:t>
             </w:r>
           </w:p>
         </w:tc>
@@ -2836,14 +2790,7 @@
                 <w:b/>
                 <w:bCs/>
               </w:rPr>
-              <w:t xml:space="preserve"> </w:t>
-            </w:r>
-            <w:r>
-              <w:rPr>
-                <w:b/>
-                <w:bCs/>
-              </w:rPr>
-              <w:t>checker</w:t>
+              <w:t xml:space="preserve"> checker</w:t>
             </w:r>
           </w:p>
         </w:tc>
@@ -2924,6 +2871,335 @@
       </w:tr>
     </w:tbl>
     <w:p/>
+    <w:p>
+      <w:pPr>
+        <w:rPr>
+          <w:rFonts w:asciiTheme="majorHAnsi" w:eastAsiaTheme="majorEastAsia" w:hAnsiTheme="majorHAnsi" w:cstheme="majorBidi"/>
+          <w:color w:val="0F4761" w:themeColor="accent1" w:themeShade="BF"/>
+          <w:sz w:val="32"/>
+          <w:szCs w:val="32"/>
+        </w:rPr>
+      </w:pPr>
+      <w:r>
+        <w:br w:type="page"/>
+      </w:r>
+    </w:p>
+    <w:p>
+      <w:pPr>
+        <w:pStyle w:val="Heading2"/>
+      </w:pPr>
+      <w:r>
+        <w:lastRenderedPageBreak/>
+        <w:t>Tables for layout</w:t>
+      </w:r>
+    </w:p>
+    <w:p>
+      <w:r>
+        <w:t xml:space="preserve">We cannot use tables for layout purposes. Tables for the presentation of data and carry certain semantic understanding for screen reader users. </w:t>
+      </w:r>
+    </w:p>
+    <w:tbl>
+      <w:tblPr>
+        <w:tblStyle w:val="TableGrid"/>
+        <w:tblW w:w="0" w:type="auto"/>
+        <w:tblBorders>
+          <w:top w:val="none" w:sz="0" w:space="0" w:color="auto"/>
+          <w:left w:val="none" w:sz="0" w:space="0" w:color="auto"/>
+          <w:bottom w:val="none" w:sz="0" w:space="0" w:color="auto"/>
+          <w:right w:val="none" w:sz="0" w:space="0" w:color="auto"/>
+          <w:insideH w:val="none" w:sz="0" w:space="0" w:color="auto"/>
+          <w:insideV w:val="none" w:sz="0" w:space="0" w:color="auto"/>
+        </w:tblBorders>
+        <w:tblCellMar>
+          <w:top w:w="29" w:type="dxa"/>
+        </w:tblCellMar>
+        <w:tblLook w:val="0480" w:firstRow="0" w:lastRow="0" w:firstColumn="1" w:lastColumn="0" w:noHBand="0" w:noVBand="1"/>
+      </w:tblPr>
+      <w:tblGrid>
+        <w:gridCol w:w="1885"/>
+        <w:gridCol w:w="7465"/>
+      </w:tblGrid>
+      <w:tr>
+        <w:tc>
+          <w:tcPr>
+            <w:tcW w:w="1885" w:type="dxa"/>
+          </w:tcPr>
+          <w:p>
+            <w:pPr>
+              <w:rPr>
+                <w:b/>
+                <w:bCs/>
+              </w:rPr>
+            </w:pPr>
+            <w:r>
+              <w:rPr>
+                <w:b/>
+                <w:bCs/>
+              </w:rPr>
+              <w:t>First name:</w:t>
+            </w:r>
+          </w:p>
+        </w:tc>
+        <w:tc>
+          <w:tcPr>
+            <w:tcW w:w="7465" w:type="dxa"/>
+          </w:tcPr>
+          <w:p>
+            <w:r>
+              <w:t>Damian</w:t>
+            </w:r>
+          </w:p>
+        </w:tc>
+      </w:tr>
+      <w:tr>
+        <w:tc>
+          <w:tcPr>
+            <w:tcW w:w="1885" w:type="dxa"/>
+          </w:tcPr>
+          <w:p>
+            <w:pPr>
+              <w:rPr>
+                <w:b/>
+                <w:bCs/>
+              </w:rPr>
+            </w:pPr>
+            <w:r>
+              <w:rPr>
+                <w:b/>
+                <w:bCs/>
+              </w:rPr>
+              <w:t xml:space="preserve">Last name: </w:t>
+            </w:r>
+          </w:p>
+        </w:tc>
+        <w:tc>
+          <w:tcPr>
+            <w:tcW w:w="7465" w:type="dxa"/>
+          </w:tcPr>
+          <w:p>
+            <w:r>
+              <w:t>Sian</w:t>
+            </w:r>
+          </w:p>
+        </w:tc>
+      </w:tr>
+      <w:tr>
+        <w:tc>
+          <w:tcPr>
+            <w:tcW w:w="1885" w:type="dxa"/>
+          </w:tcPr>
+          <w:p>
+            <w:pPr>
+              <w:rPr>
+                <w:b/>
+                <w:bCs/>
+              </w:rPr>
+            </w:pPr>
+            <w:r>
+              <w:rPr>
+                <w:b/>
+                <w:bCs/>
+              </w:rPr>
+              <w:t>Title:</w:t>
+            </w:r>
+          </w:p>
+        </w:tc>
+        <w:tc>
+          <w:tcPr>
+            <w:tcW w:w="7465" w:type="dxa"/>
+          </w:tcPr>
+          <w:p>
+            <w:r>
+              <w:t>Adjunct professor</w:t>
+            </w:r>
+          </w:p>
+        </w:tc>
+      </w:tr>
+      <w:tr>
+        <w:tc>
+          <w:tcPr>
+            <w:tcW w:w="1885" w:type="dxa"/>
+          </w:tcPr>
+          <w:p>
+            <w:pPr>
+              <w:rPr>
+                <w:b/>
+                <w:bCs/>
+              </w:rPr>
+            </w:pPr>
+            <w:r>
+              <w:rPr>
+                <w:b/>
+                <w:bCs/>
+              </w:rPr>
+              <w:t xml:space="preserve">Department: </w:t>
+            </w:r>
+          </w:p>
+        </w:tc>
+        <w:tc>
+          <w:tcPr>
+            <w:tcW w:w="7465" w:type="dxa"/>
+          </w:tcPr>
+          <w:p>
+            <w:r>
+              <w:t>School of Communication and Information</w:t>
+            </w:r>
+          </w:p>
+        </w:tc>
+      </w:tr>
+      <w:tr>
+        <w:tc>
+          <w:tcPr>
+            <w:tcW w:w="1885" w:type="dxa"/>
+          </w:tcPr>
+          <w:p>
+            <w:pPr>
+              <w:rPr>
+                <w:b/>
+                <w:bCs/>
+              </w:rPr>
+            </w:pPr>
+            <w:r>
+              <w:rPr>
+                <w:b/>
+                <w:bCs/>
+              </w:rPr>
+              <w:t>Group:</w:t>
+            </w:r>
+          </w:p>
+        </w:tc>
+        <w:tc>
+          <w:tcPr>
+            <w:tcW w:w="7465" w:type="dxa"/>
+          </w:tcPr>
+          <w:p>
+            <w:r>
+              <w:t>Library Sciences</w:t>
+            </w:r>
+          </w:p>
+        </w:tc>
+      </w:tr>
+    </w:tbl>
+    <w:p/>
+    <w:p>
+      <w:pPr>
+        <w:pStyle w:val="Heading3"/>
+      </w:pPr>
+      <w:r>
+        <w:t>Fixes</w:t>
+      </w:r>
+      <w:r>
+        <w:t xml:space="preserve"> in Microsoft</w:t>
+      </w:r>
+    </w:p>
+    <w:p>
+      <w:r>
+        <w:t xml:space="preserve">Use tab stops and tab stop locations in the ruler of Microsoft Office. </w:t>
+      </w:r>
+    </w:p>
+    <w:p>
+      <w:pPr>
+        <w:tabs>
+          <w:tab w:val="left" w:pos="2070"/>
+        </w:tabs>
+        <w:spacing w:after="40"/>
+      </w:pPr>
+      <w:r>
+        <w:rPr>
+          <w:b/>
+          <w:bCs/>
+        </w:rPr>
+        <w:t>First name</w:t>
+      </w:r>
+      <w:r>
+        <w:tab/>
+      </w:r>
+      <w:r>
+        <w:t>Damian</w:t>
+      </w:r>
+    </w:p>
+    <w:p>
+      <w:pPr>
+        <w:tabs>
+          <w:tab w:val="left" w:pos="2070"/>
+        </w:tabs>
+        <w:spacing w:after="40"/>
+      </w:pPr>
+      <w:r>
+        <w:rPr>
+          <w:b/>
+          <w:bCs/>
+        </w:rPr>
+        <w:t>Last name:</w:t>
+      </w:r>
+      <w:r>
+        <w:tab/>
+      </w:r>
+      <w:r>
+        <w:t>Sian</w:t>
+      </w:r>
+    </w:p>
+    <w:p>
+      <w:pPr>
+        <w:tabs>
+          <w:tab w:val="left" w:pos="2070"/>
+        </w:tabs>
+        <w:spacing w:after="40"/>
+      </w:pPr>
+      <w:r>
+        <w:rPr>
+          <w:b/>
+          <w:bCs/>
+        </w:rPr>
+        <w:t>Title:</w:t>
+      </w:r>
+      <w:r>
+        <w:tab/>
+        <w:t>Adjunct professor</w:t>
+      </w:r>
+    </w:p>
+    <w:p>
+      <w:pPr>
+        <w:tabs>
+          <w:tab w:val="left" w:pos="2070"/>
+        </w:tabs>
+        <w:spacing w:after="40"/>
+      </w:pPr>
+      <w:r>
+        <w:rPr>
+          <w:b/>
+          <w:bCs/>
+        </w:rPr>
+        <w:t>Department:</w:t>
+      </w:r>
+      <w:r>
+        <w:tab/>
+      </w:r>
+      <w:r>
+        <w:t>School of Communication and Information</w:t>
+      </w:r>
+    </w:p>
+    <w:p>
+      <w:pPr>
+        <w:tabs>
+          <w:tab w:val="left" w:pos="2070"/>
+        </w:tabs>
+        <w:spacing w:after="40"/>
+      </w:pPr>
+      <w:r>
+        <w:rPr>
+          <w:b/>
+          <w:bCs/>
+        </w:rPr>
+        <w:t>Group:</w:t>
+      </w:r>
+      <w:r>
+        <w:tab/>
+      </w:r>
+      <w:r>
+        <w:t>Library Sciences</w:t>
+      </w:r>
+    </w:p>
     <w:p>
       <w:pPr>
         <w:pStyle w:val="Heading2"/>
@@ -3565,6 +3841,7 @@
   <w:style w:type="character" w:default="1" w:styleId="DefaultParagraphFont">
     <w:name w:val="Default Paragraph Font"/>
     <w:uiPriority w:val="1"/>
+    <w:semiHidden/>
     <w:unhideWhenUsed/>
   </w:style>
   <w:style w:type="table" w:default="1" w:styleId="TableNormal">

</xml_diff>